<commit_message>
docs(qms): current GitHub evidence — v1.4.1 tag and the defect-fix commit
Co-Authored-By: Claude Opus 5.5 <noreply@anthropic.com>
</commit_message>
<xml_diff>
--- a/docs/qms/evidence-2026/00_Overview_and_Map/EM26-00_ISO9001_Audit_Package_EchoMind_Enterprise.docx
+++ b/docs/qms/evidence-2026/00_Overview_and_Map/EM26-00_ISO9001_Audit_Package_EchoMind_Enterprise.docx
@@ -2728,7 +2728,7 @@
           <wp:inline distT="0" distB="0" distL="0" distR="0">
             <wp:extent cx="5905500" cy="4105275"/>
             <wp:effectExtent t="0" r="0" b="0" l="0"/>
-            <wp:docPr id="16" name="" descr="" title=""/>
+            <wp:docPr id="18" name="" descr="" title=""/>
             <wp:cNvGraphicFramePr>
               <a:graphicFrameLocks xmlns:a="http://schemas.openxmlformats.org/drawingml/2006/main" noChangeAspect="1"/>
             </wp:cNvGraphicFramePr>
@@ -2790,7 +2790,7 @@
           <wp:inline distT="0" distB="0" distL="0" distR="0">
             <wp:extent cx="5905500" cy="4105275"/>
             <wp:effectExtent t="0" r="0" b="0" l="0"/>
-            <wp:docPr id="17" name="" descr="" title=""/>
+            <wp:docPr id="19" name="" descr="" title=""/>
             <wp:cNvGraphicFramePr>
               <a:graphicFrameLocks xmlns:a="http://schemas.openxmlformats.org/drawingml/2006/main" noChangeAspect="1"/>
             </wp:cNvGraphicFramePr>
@@ -2860,7 +2860,7 @@
           <wp:inline distT="0" distB="0" distL="0" distR="0">
             <wp:extent cx="5905500" cy="3695700"/>
             <wp:effectExtent t="0" r="0" b="0" l="0"/>
-            <wp:docPr id="18" name="" descr="" title=""/>
+            <wp:docPr id="20" name="" descr="" title=""/>
             <wp:cNvGraphicFramePr>
               <a:graphicFrameLocks xmlns:a="http://schemas.openxmlformats.org/drawingml/2006/main" noChangeAspect="1"/>
             </wp:cNvGraphicFramePr>
@@ -2922,7 +2922,7 @@
           <wp:inline distT="0" distB="0" distL="0" distR="0">
             <wp:extent cx="5905500" cy="3695700"/>
             <wp:effectExtent t="0" r="0" b="0" l="0"/>
-            <wp:docPr id="19" name="" descr="" title=""/>
+            <wp:docPr id="21" name="" descr="" title=""/>
             <wp:cNvGraphicFramePr>
               <a:graphicFrameLocks xmlns:a="http://schemas.openxmlformats.org/drawingml/2006/main" noChangeAspect="1"/>
             </wp:cNvGraphicFramePr>
@@ -3000,7 +3000,7 @@
           <wp:inline distT="0" distB="0" distL="0" distR="0">
             <wp:extent cx="4953000" cy="1524000"/>
             <wp:effectExtent t="0" r="0" b="0" l="0"/>
-            <wp:docPr id="20" name="" descr="" title=""/>
+            <wp:docPr id="22" name="" descr="" title=""/>
             <wp:cNvGraphicFramePr>
               <a:graphicFrameLocks xmlns:a="http://schemas.openxmlformats.org/drawingml/2006/main" noChangeAspect="1"/>
             </wp:cNvGraphicFramePr>

</xml_diff>

<commit_message>
docs(qms): project board evidence — 65 tracked tickets replace the 2025 Jira screens
Co-Authored-By: Claude Opus 5.5 <noreply@anthropic.com>
</commit_message>
<xml_diff>
--- a/docs/qms/evidence-2026/00_Overview_and_Map/EM26-00_ISO9001_Audit_Package_EchoMind_Enterprise.docx
+++ b/docs/qms/evidence-2026/00_Overview_and_Map/EM26-00_ISO9001_Audit_Package_EchoMind_Enterprise.docx
@@ -1476,7 +1476,7 @@
                 <w:sz w:val="17"/>
                 <w:szCs w:val="17"/>
               </w:rPr>
-              <w:t xml:space="preserve">EM26-12 Scheduling Review; SDLC record; GitHub history (SCR-10/11)</w:t>
+              <w:t xml:space="preserve">EM26-12 Scheduling Review; SDLC record; GitHub history and project board (SCR-10/11/20)</w:t>
             </w:r>
           </w:p>
         </w:tc>
@@ -2715,20 +2715,28 @@
         <w:pStyle w:val="Heading1"/>
       </w:pPr>
       <w:r>
-        <w:t xml:space="preserve">5. Project management — repository</w:t>
+        <w:t xml:space="preserve">5. Project management — repository and tracking board</w:t>
       </w:r>
     </w:p>
     <w:p>
       <w:pPr>
+        <w:spacing w:after="100"/>
+      </w:pPr>
+      <w:r>
+        <w:t xml:space="preserve">Work, defects and corrective actions are tracked as GitHub issues on the project board https://github.com/users/RW2523/projects/2 (65 tickets: 14 features, 16 defects/NCs, 3 reviews, 32 tasks), each linked to its REG-04/REG-10 record and fix commits. The board was set up on 2026-10-06; earlier work was transcribed to it from git and the registers, and each such ticket says so.</w:t>
+      </w:r>
+    </w:p>
+    <w:p>
+      <w:pPr>
         <w:spacing w:before="120"/>
         <w:jc w:val="center"/>
       </w:pPr>
       <w:r>
         <w:drawing>
           <wp:inline distT="0" distB="0" distL="0" distR="0">
-            <wp:extent cx="5905500" cy="4105275"/>
+            <wp:extent cx="5905500" cy="3695700"/>
             <wp:effectExtent t="0" r="0" b="0" l="0"/>
-            <wp:docPr id="18" name="" descr="" title=""/>
+            <wp:docPr id="20" name="" descr="" title=""/>
             <wp:cNvGraphicFramePr>
               <a:graphicFrameLocks xmlns:a="http://schemas.openxmlformats.org/drawingml/2006/main" noChangeAspect="1"/>
             </wp:cNvGraphicFramePr>
@@ -2751,7 +2759,7 @@
                   <pic:spPr bwMode="auto">
                     <a:xfrm>
                       <a:off x="0" y="0"/>
-                      <a:ext cx="5905500" cy="4105275"/>
+                      <a:ext cx="5905500" cy="3695700"/>
                     </a:xfrm>
                     <a:prstGeom prst="rect">
                       <a:avLst/>
@@ -2777,7 +2785,7 @@
           <w:sz w:val="17"/>
           <w:szCs w:val="17"/>
         </w:rPr>
-        <w:t xml:space="preserve">SCR-10 — repository on GitHub</w:t>
+        <w:t xml:space="preserve">SCR-20 — project board (replaces the 2025 Jira SCRUM board)</w:t>
       </w:r>
     </w:p>
     <w:p>
@@ -2790,7 +2798,7 @@
           <wp:inline distT="0" distB="0" distL="0" distR="0">
             <wp:extent cx="5905500" cy="4105275"/>
             <wp:effectExtent t="0" r="0" b="0" l="0"/>
-            <wp:docPr id="19" name="" descr="" title=""/>
+            <wp:docPr id="21" name="" descr="" title=""/>
             <wp:cNvGraphicFramePr>
               <a:graphicFrameLocks xmlns:a="http://schemas.openxmlformats.org/drawingml/2006/main" noChangeAspect="1"/>
             </wp:cNvGraphicFramePr>
@@ -2839,28 +2847,20 @@
           <w:sz w:val="17"/>
           <w:szCs w:val="17"/>
         </w:rPr>
-        <w:t xml:space="preserve">SCR-11 — commit history</w:t>
+        <w:t xml:space="preserve">SCR-10 — repository on GitHub</w:t>
       </w:r>
     </w:p>
     <w:p>
       <w:pPr>
-        <w:pStyle w:val="Heading1"/>
-      </w:pPr>
-      <w:r>
-        <w:t xml:space="preserve">6. The product</w:t>
-      </w:r>
-    </w:p>
-    <w:p>
-      <w:pPr>
         <w:spacing w:before="120"/>
         <w:jc w:val="center"/>
       </w:pPr>
       <w:r>
         <w:drawing>
           <wp:inline distT="0" distB="0" distL="0" distR="0">
-            <wp:extent cx="5905500" cy="3695700"/>
+            <wp:extent cx="5905500" cy="4105275"/>
             <wp:effectExtent t="0" r="0" b="0" l="0"/>
-            <wp:docPr id="20" name="" descr="" title=""/>
+            <wp:docPr id="22" name="" descr="" title=""/>
             <wp:cNvGraphicFramePr>
               <a:graphicFrameLocks xmlns:a="http://schemas.openxmlformats.org/drawingml/2006/main" noChangeAspect="1"/>
             </wp:cNvGraphicFramePr>
@@ -2883,7 +2883,7 @@
                   <pic:spPr bwMode="auto">
                     <a:xfrm>
                       <a:off x="0" y="0"/>
-                      <a:ext cx="5905500" cy="3695700"/>
+                      <a:ext cx="5905500" cy="4105275"/>
                     </a:xfrm>
                     <a:prstGeom prst="rect">
                       <a:avLst/>
@@ -2909,7 +2909,15 @@
           <w:sz w:val="17"/>
           <w:szCs w:val="17"/>
         </w:rPr>
-        <w:t xml:space="preserve">SCR-03 — Knowledge Chat after login</w:t>
+        <w:t xml:space="preserve">SCR-11 — commit history</w:t>
+      </w:r>
+    </w:p>
+    <w:p>
+      <w:pPr>
+        <w:pStyle w:val="Heading1"/>
+      </w:pPr>
+      <w:r>
+        <w:t xml:space="preserve">6. The product</w:t>
       </w:r>
     </w:p>
     <w:p>
@@ -2922,7 +2930,7 @@
           <wp:inline distT="0" distB="0" distL="0" distR="0">
             <wp:extent cx="5905500" cy="3695700"/>
             <wp:effectExtent t="0" r="0" b="0" l="0"/>
-            <wp:docPr id="21" name="" descr="" title=""/>
+            <wp:docPr id="23" name="" descr="" title=""/>
             <wp:cNvGraphicFramePr>
               <a:graphicFrameLocks xmlns:a="http://schemas.openxmlformats.org/drawingml/2006/main" noChangeAspect="1"/>
             </wp:cNvGraphicFramePr>
@@ -2971,36 +2979,20 @@
           <w:sz w:val="17"/>
           <w:szCs w:val="17"/>
         </w:rPr>
-        <w:t xml:space="preserve">SCR-04 — grounded answer with sources</w:t>
+        <w:t xml:space="preserve">SCR-03 — Knowledge Chat after login</w:t>
       </w:r>
     </w:p>
     <w:p>
       <w:pPr>
-        <w:pStyle w:val="Heading1"/>
-      </w:pPr>
-      <w:r>
-        <w:t xml:space="preserve">7. Release and traceability</w:t>
-      </w:r>
-    </w:p>
-    <w:p>
-      <w:pPr>
-        <w:spacing w:after="100"/>
-      </w:pPr>
-      <w:r>
-        <w:t xml:space="preserve">All three services report release v1.4.1 (commit f1b8445) — see SCR-09 and REG-08.</w:t>
-      </w:r>
-    </w:p>
-    <w:p>
-      <w:pPr>
         <w:spacing w:before="120"/>
         <w:jc w:val="center"/>
       </w:pPr>
       <w:r>
         <w:drawing>
           <wp:inline distT="0" distB="0" distL="0" distR="0">
-            <wp:extent cx="4953000" cy="1524000"/>
+            <wp:extent cx="5905500" cy="3695700"/>
             <wp:effectExtent t="0" r="0" b="0" l="0"/>
-            <wp:docPr id="22" name="" descr="" title=""/>
+            <wp:docPr id="24" name="" descr="" title=""/>
             <wp:cNvGraphicFramePr>
               <a:graphicFrameLocks xmlns:a="http://schemas.openxmlformats.org/drawingml/2006/main" noChangeAspect="1"/>
             </wp:cNvGraphicFramePr>
@@ -3015,6 +3007,84 @@
                   </pic:nvPicPr>
                   <pic:blipFill>
                     <a:blip r:embed="rId13" cstate="none"/>
+                    <a:srcRect/>
+                    <a:stretch>
+                      <a:fillRect/>
+                    </a:stretch>
+                  </pic:blipFill>
+                  <pic:spPr bwMode="auto">
+                    <a:xfrm>
+                      <a:off x="0" y="0"/>
+                      <a:ext cx="5905500" cy="3695700"/>
+                    </a:xfrm>
+                    <a:prstGeom prst="rect">
+                      <a:avLst/>
+                    </a:prstGeom>
+                  </pic:spPr>
+                </pic:pic>
+              </a:graphicData>
+            </a:graphic>
+          </wp:inline>
+        </w:drawing>
+      </w:r>
+    </w:p>
+    <w:p>
+      <w:pPr>
+        <w:spacing w:after="200"/>
+        <w:jc w:val="center"/>
+      </w:pPr>
+      <w:r>
+        <w:rPr>
+          <w:i/>
+          <w:iCs/>
+          <w:color w:val="555555"/>
+          <w:sz w:val="17"/>
+          <w:szCs w:val="17"/>
+        </w:rPr>
+        <w:t xml:space="preserve">SCR-04 — grounded answer with sources</w:t>
+      </w:r>
+    </w:p>
+    <w:p>
+      <w:pPr>
+        <w:pStyle w:val="Heading1"/>
+      </w:pPr>
+      <w:r>
+        <w:t xml:space="preserve">7. Release and traceability</w:t>
+      </w:r>
+    </w:p>
+    <w:p>
+      <w:pPr>
+        <w:spacing w:after="100"/>
+      </w:pPr>
+      <w:r>
+        <w:t xml:space="preserve">All three services report release v1.4.1 (commit f1b8445) — see SCR-09 and REG-08.</w:t>
+      </w:r>
+    </w:p>
+    <w:p>
+      <w:pPr>
+        <w:spacing w:before="120"/>
+        <w:jc w:val="center"/>
+      </w:pPr>
+      <w:r>
+        <w:drawing>
+          <wp:inline distT="0" distB="0" distL="0" distR="0">
+            <wp:extent cx="4953000" cy="1524000"/>
+            <wp:effectExtent t="0" r="0" b="0" l="0"/>
+            <wp:docPr id="25" name="" descr="" title=""/>
+            <wp:cNvGraphicFramePr>
+              <a:graphicFrameLocks xmlns:a="http://schemas.openxmlformats.org/drawingml/2006/main" noChangeAspect="1"/>
+            </wp:cNvGraphicFramePr>
+            <a:graphic xmlns:a="http://schemas.openxmlformats.org/drawingml/2006/main">
+              <a:graphicData uri="http://schemas.openxmlformats.org/drawingml/2006/picture">
+                <pic:pic xmlns:pic="http://schemas.openxmlformats.org/drawingml/2006/picture">
+                  <pic:nvPicPr>
+                    <pic:cNvPr id="0" name="" descr=""/>
+                    <pic:cNvPicPr>
+                      <a:picLocks noChangeAspect="1" noChangeArrowheads="1"/>
+                    </pic:cNvPicPr>
+                  </pic:nvPicPr>
+                  <pic:blipFill>
+                    <a:blip r:embed="rId14" cstate="none"/>
                     <a:srcRect/>
                     <a:stretch>
                       <a:fillRect/>

</xml_diff>

<commit_message>
docs(qms): revision 1.1 approved (AR-2026-002) — review and NFR evidence signed off
Alexander Peter (review), Sheryl Nazareth (QA) and Anita Johan (Managing Director)
confirmed revision 1.1 on 2026-10-10. Approval record:
docs/qms/records/approvals/2026-10-10_AR-2026-002_revision_approval.md

- EM26-17 and EM26-18 rev 1.1: status APPROVED, signatures dated 2026-10-10
- EM26-00, EM26-12, EM26-16, EM26-16b rev 1.1 under the same approval
- REG-10, REG-01 and QM-01 point to AR-2026-002
- Client names stay out of the public copy (Client A–D)

Co-Authored-By: Claude Opus 5.5 <noreply@anthropic.com>
</commit_message>
<xml_diff>
--- a/docs/qms/evidence-2026/00_Overview_and_Map/EM26-00_ISO9001_Audit_Package_EchoMind_Enterprise.docx
+++ b/docs/qms/evidence-2026/00_Overview_and_Map/EM26-00_ISO9001_Audit_Package_EchoMind_Enterprise.docx
@@ -301,7 +301,7 @@
                 <w:sz w:val="17"/>
                 <w:szCs w:val="17"/>
               </w:rPr>
-              <w:t xml:space="preserve">1.0</w:t>
+              <w:t xml:space="preserve">1.1</w:t>
             </w:r>
           </w:p>
         </w:tc>
@@ -361,7 +361,7 @@
                 <w:sz w:val="17"/>
                 <w:szCs w:val="17"/>
               </w:rPr>
-              <w:t xml:space="preserve">2026-10-06</w:t>
+              <w:t xml:space="preserve">2026-10-10</w:t>
             </w:r>
           </w:p>
         </w:tc>
@@ -421,7 +421,7 @@
                 <w:sz w:val="17"/>
                 <w:szCs w:val="17"/>
               </w:rPr>
-              <w:t xml:space="preserve">APPROVED — 2026-10-07 (AR-2026-001)</w:t>
+              <w:t xml:space="preserve">APPROVED — rev 1.1 2026-10-10 (AR-2026-002); rev 1.0 2026-10-07 (AR-2026-001)</w:t>
             </w:r>
           </w:p>
         </w:tc>
@@ -512,7 +512,7 @@
                 <w:sz w:val="17"/>
                 <w:szCs w:val="17"/>
               </w:rPr>
-              <w:t xml:space="preserve">Prepared by</w:t>
+              <w:t xml:space="preserve">Revision 1.1 (2026-10-10)</w:t>
             </w:r>
           </w:p>
         </w:tc>
@@ -541,7 +541,7 @@
                 <w:sz w:val="17"/>
                 <w:szCs w:val="17"/>
               </w:rPr>
-              <w:t xml:space="preserve">Richard Watson Stephen Amudha (Lead Engineer)</w:t>
+              <w:t xml:space="preserve">Status of 2025 findings #6/#7 and review counts updated</w:t>
             </w:r>
           </w:p>
         </w:tc>
@@ -572,7 +572,7 @@
                 <w:sz w:val="17"/>
                 <w:szCs w:val="17"/>
               </w:rPr>
-              <w:t xml:space="preserve">Reviewed by</w:t>
+              <w:t xml:space="preserve">Prepared by</w:t>
             </w:r>
           </w:p>
         </w:tc>
@@ -601,7 +601,7 @@
                 <w:sz w:val="17"/>
                 <w:szCs w:val="17"/>
               </w:rPr>
-              <w:t xml:space="preserve">Alexander Peter (EchoMind Project Lead)</w:t>
+              <w:t xml:space="preserve">Richard Watson Stephen Amudha (Lead Engineer)</w:t>
             </w:r>
           </w:p>
         </w:tc>
@@ -632,7 +632,7 @@
                 <w:sz w:val="17"/>
                 <w:szCs w:val="17"/>
               </w:rPr>
-              <w:t xml:space="preserve">Quality assurance</w:t>
+              <w:t xml:space="preserve">Reviewed by</w:t>
             </w:r>
           </w:p>
         </w:tc>
@@ -661,7 +661,7 @@
                 <w:sz w:val="17"/>
                 <w:szCs w:val="17"/>
               </w:rPr>
-              <w:t xml:space="preserve">Sheryl Nazareth (QA / MR)</w:t>
+              <w:t xml:space="preserve">Alexander Peter (EchoMind Project Lead)</w:t>
             </w:r>
           </w:p>
         </w:tc>
@@ -692,6 +692,66 @@
                 <w:sz w:val="17"/>
                 <w:szCs w:val="17"/>
               </w:rPr>
+              <w:t xml:space="preserve">Quality assurance</w:t>
+            </w:r>
+          </w:p>
+        </w:tc>
+        <w:tc>
+          <w:tcPr>
+            <w:tcW w:type="dxa" w:w="6760"/>
+            <w:tcBorders>
+              <w:top w:val="single" w:color="BFC7D5" w:sz="4"/>
+              <w:left w:val="single" w:color="BFC7D5" w:sz="4"/>
+              <w:bottom w:val="single" w:color="BFC7D5" w:sz="4"/>
+              <w:right w:val="single" w:color="BFC7D5" w:sz="4"/>
+            </w:tcBorders>
+            <w:tcMar>
+              <w:top w:type="dxa" w:w="60"/>
+              <w:left w:type="dxa" w:w="90"/>
+              <w:bottom w:type="dxa" w:w="60"/>
+              <w:right w:type="dxa" w:w="90"/>
+            </w:tcMar>
+          </w:tcPr>
+          <w:p>
+            <w:r>
+              <w:rPr>
+                <w:b w:val="false"/>
+                <w:bCs w:val="false"/>
+                <w:color w:val="222222"/>
+                <w:sz w:val="17"/>
+                <w:szCs w:val="17"/>
+              </w:rPr>
+              <w:t xml:space="preserve">Sheryl Nazareth (QA / MR)</w:t>
+            </w:r>
+          </w:p>
+        </w:tc>
+      </w:tr>
+      <w:tr>
+        <w:tc>
+          <w:tcPr>
+            <w:tcW w:type="dxa" w:w="2600"/>
+            <w:tcBorders>
+              <w:top w:val="single" w:color="BFC7D5" w:sz="4"/>
+              <w:left w:val="single" w:color="BFC7D5" w:sz="4"/>
+              <w:bottom w:val="single" w:color="BFC7D5" w:sz="4"/>
+              <w:right w:val="single" w:color="BFC7D5" w:sz="4"/>
+            </w:tcBorders>
+            <w:tcMar>
+              <w:top w:type="dxa" w:w="60"/>
+              <w:left w:type="dxa" w:w="90"/>
+              <w:bottom w:type="dxa" w:w="60"/>
+              <w:right w:type="dxa" w:w="90"/>
+            </w:tcMar>
+          </w:tcPr>
+          <w:p>
+            <w:r>
+              <w:rPr>
+                <w:b w:val="false"/>
+                <w:bCs w:val="false"/>
+                <w:color w:val="222222"/>
+                <w:sz w:val="17"/>
+                <w:szCs w:val="17"/>
+              </w:rPr>
               <w:t xml:space="preserve">Approved by</w:t>
             </w:r>
           </w:p>
@@ -721,7 +781,7 @@
                 <w:sz w:val="17"/>
                 <w:szCs w:val="17"/>
               </w:rPr>
-              <w:t xml:space="preserve">Anita Johan (Managing Director) — 2026-10-07</w:t>
+              <w:t xml:space="preserve">Anita Johan (Managing Director) — 2026-10-10</w:t>
             </w:r>
           </w:p>
         </w:tc>
@@ -3542,7 +3602,7 @@
                 <w:sz w:val="17"/>
                 <w:szCs w:val="17"/>
               </w:rPr>
-              <w:t xml:space="preserve">2026-10-07</w:t>
+              <w:t xml:space="preserve">2026-10-10</w:t>
             </w:r>
           </w:p>
         </w:tc>
@@ -3660,7 +3720,7 @@
                 <w:sz w:val="17"/>
                 <w:szCs w:val="17"/>
               </w:rPr>
-              <w:t xml:space="preserve">2026-10-07</w:t>
+              <w:t xml:space="preserve">2026-10-10</w:t>
             </w:r>
           </w:p>
         </w:tc>
@@ -3778,7 +3838,7 @@
                 <w:sz w:val="17"/>
                 <w:szCs w:val="17"/>
               </w:rPr>
-              <w:t xml:space="preserve">2026-10-07</w:t>
+              <w:t xml:space="preserve">2026-10-10</w:t>
             </w:r>
           </w:p>
         </w:tc>
@@ -3896,7 +3956,7 @@
                 <w:sz w:val="17"/>
                 <w:szCs w:val="17"/>
               </w:rPr>
-              <w:t xml:space="preserve">2026-10-07</w:t>
+              <w:t xml:space="preserve">2026-10-10</w:t>
             </w:r>
           </w:p>
         </w:tc>
@@ -3921,7 +3981,7 @@
           <w:sz w:val="17"/>
           <w:szCs w:val="17"/>
         </w:rPr>
-        <w:t xml:space="preserve">Signatures are the typed names of the role holders. Review and approval were confirmed by each of them on 2026-10-07 and are recorded in docs/qms/records/approvals/2026-10-07_AR-2026-001_document_approval.md (SOP-01 §6).</w:t>
+        <w:t xml:space="preserve">Signatures are the typed names of the role holders. Revision 1.1 was reviewed and approved by each of them on 2026-10-10 (docs/qms/records/approvals/2026-10-10_AR-2026-002_revision_approval.md); revision 1.0 on 2026-10-07 (AR-2026-001) (SOP-01 §6).</w:t>
       </w:r>
     </w:p>
     <w:sectPr>

</xml_diff>